<commit_message>
chore: a little different diagrams
</commit_message>
<xml_diff>
--- a/concurrency/Lab1_Concurrency_Report_v2.0.docx
+++ b/concurrency/Lab1_Concurrency_Report_v2.0.docx
@@ -3378,7 +3378,7 @@
                 <w:szCs w:val="20"/>
                 <w:rtl w:val="0"/>
               </w:rPr>
-              <w:t xml:space="preserve">31</w:t>
+              <w:t xml:space="preserve">26</w:t>
             </w:r>
             <w:r>
               <w:rPr>
@@ -3565,7 +3565,7 @@
           <w:szCs w:val="24"/>
           <w:rtl w:val="0"/>
         </w:rPr>
-        <w:t xml:space="preserve">Note: peak memory is 236 MB because the entire dataset (50 000 000 integers) is stored in memory as an int[] array (200 MB for the array plus .NET runtime overhead). Version 3 is ~193x faster than Version 2 because threads work purely in local CPU cache with no lock contention.</w:t>
+        <w:t xml:space="preserve">Note: peak memory is 245 MB because the entire dataset (50 000 000 integers) is stored in memory as an int[] array (200 MB for the array plus .NET runtime overhead). Version 3 is ~193x faster than Version 2 because threads work purely in local CPU cache with no lock contention.</w:t>
       </w:r>
       <w:r>
         <w:rPr>
@@ -3917,7 +3917,7 @@
                 <w:szCs w:val="20"/>
                 <w:rtl w:val="0"/>
               </w:rPr>
-              <w:t xml:space="preserve">63</w:t>
+              <w:t xml:space="preserve">89</w:t>
             </w:r>
             <w:r>
               <w:rPr>
@@ -3940,7 +3940,7 @@
                 <w:szCs w:val="20"/>
                 <w:rtl w:val="0"/>
               </w:rPr>
-              <w:t xml:space="preserve">78</w:t>
+              <w:t xml:space="preserve">101</w:t>
             </w:r>
             <w:r>
               <w:rPr>
@@ -4038,7 +4038,7 @@
                 <w:szCs w:val="20"/>
                 <w:rtl w:val="0"/>
               </w:rPr>
-              <w:t xml:space="preserve">68</w:t>
+              <w:t xml:space="preserve">78</w:t>
             </w:r>
             <w:r>
               <w:rPr>
@@ -4061,7 +4061,7 @@
                 <w:szCs w:val="20"/>
                 <w:rtl w:val="0"/>
               </w:rPr>
-              <w:t xml:space="preserve">54</w:t>
+              <w:t xml:space="preserve">60</w:t>
             </w:r>
             <w:r>
               <w:rPr>
@@ -4159,7 +4159,7 @@
                 <w:szCs w:val="20"/>
                 <w:rtl w:val="0"/>
               </w:rPr>
-              <w:t xml:space="preserve">48</w:t>
+              <w:t xml:space="preserve">60</w:t>
             </w:r>
             <w:r>
               <w:rPr>
@@ -4182,7 +4182,7 @@
                 <w:szCs w:val="20"/>
                 <w:rtl w:val="0"/>
               </w:rPr>
-              <w:t xml:space="preserve">48</w:t>
+              <w:t xml:space="preserve">62</w:t>
             </w:r>
             <w:r>
               <w:rPr>
@@ -4280,7 +4280,7 @@
                 <w:szCs w:val="20"/>
                 <w:rtl w:val="0"/>
               </w:rPr>
-              <w:t xml:space="preserve">58</w:t>
+              <w:t xml:space="preserve">66</w:t>
             </w:r>
             <w:r>
               <w:rPr>
@@ -4303,7 +4303,7 @@
                 <w:szCs w:val="20"/>
                 <w:rtl w:val="0"/>
               </w:rPr>
-              <w:t xml:space="preserve">57</w:t>
+              <w:t xml:space="preserve">66</w:t>
             </w:r>
             <w:r>
               <w:rPr>
@@ -4401,7 +4401,7 @@
                 <w:szCs w:val="20"/>
                 <w:rtl w:val="0"/>
               </w:rPr>
-              <w:t xml:space="preserve">72</w:t>
+              <w:t xml:space="preserve">81</w:t>
             </w:r>
             <w:r>
               <w:rPr>
@@ -4424,7 +4424,7 @@
                 <w:szCs w:val="20"/>
                 <w:rtl w:val="0"/>
               </w:rPr>
-              <w:t xml:space="preserve">72</w:t>
+              <w:t xml:space="preserve">77</w:t>
             </w:r>
             <w:r>
               <w:rPr>
@@ -4522,7 +4522,7 @@
                 <w:szCs w:val="20"/>
                 <w:rtl w:val="0"/>
               </w:rPr>
-              <w:t xml:space="preserve">86</w:t>
+              <w:t xml:space="preserve">98</w:t>
             </w:r>
             <w:r>
               <w:rPr>
@@ -4545,7 +4545,7 @@
                 <w:szCs w:val="20"/>
                 <w:rtl w:val="0"/>
               </w:rPr>
-              <w:t xml:space="preserve">87</w:t>
+              <w:t xml:space="preserve">101</w:t>
             </w:r>
             <w:r>
               <w:rPr>
@@ -4643,7 +4643,7 @@
                 <w:szCs w:val="20"/>
                 <w:rtl w:val="0"/>
               </w:rPr>
-              <w:t xml:space="preserve">122</w:t>
+              <w:t xml:space="preserve">134</w:t>
             </w:r>
             <w:r>
               <w:rPr>
@@ -4666,7 +4666,7 @@
                 <w:szCs w:val="20"/>
                 <w:rtl w:val="0"/>
               </w:rPr>
-              <w:t xml:space="preserve">121</w:t>
+              <w:t xml:space="preserve">133</w:t>
             </w:r>
             <w:r>
               <w:rPr>
@@ -5474,7 +5474,7 @@
           <w:szCs w:val="24"/>
           <w:rtl w:val="0"/>
         </w:rPr>
-        <w:t xml:space="preserve">Note: peak memory stays around 48-78 MB up to 16 workers, rising slightly to 121 MB at 64 workers due to thread stacks. Memory remains low because the queue is bounded to 100 batches (at most 1 000 000 lines in memory at once).</w:t>
+        <w:t xml:space="preserve">Note: peak memory stays around 60-101 MB up to 16 workers, rising slightly to 134 MB at 64 workers due to thread stacks. Memory remains low because the queue is bounded to 100 batches (at most 1 000 000 lines in memory at once).</w:t>
       </w:r>
       <w:r>
         <w:rPr>
@@ -5655,7 +5655,7 @@
           <w:szCs w:val="24"/>
           <w:rtl w:val="0"/>
         </w:rPr>
-        <w:t xml:space="preserve">Across Task 1, memory behavior depends on the data architecture, not thread count: - In Task 1a, peak memory stays around 51-58 MB regardless of thread count because each thread only streams through its partition with a small StreamReader buffer (~4-8 KB). The file is never loaded into RAM. - In Task 1b, peak memory is 236 MB regardless of thread count because all 50 000 000 integers are preloaded into an int[] array in memory (~200 MB for array data plus runtime overhead). - In Task 1c, peak memory stays around 48-78 MB up to 16 workers because the queue is bounded to 100 batches (at most 1 000 000 lines buffered at once), rising slightly to 121 MB at 64 workers due to OS thread stack allocations.</w:t>
+        <w:t xml:space="preserve">Across Task 1, memory behavior depends on the data architecture, not thread count: - In Task 1a, peak memory stays around 51-58 MB regardless of thread count because each thread only streams through its partition with a small StreamReader buffer (~4-8 KB). The file is never loaded into RAM. - In Task 1b, peak memory is 245 MB regardless of thread count because all 50 000 000 integers are preloaded into an int[] array in memory (~200 MB for array data plus runtime overhead). - In Task 1c, peak memory stays around 60-101 MB up to 16 workers because the queue is bounded to 100 batches (at most 1 000 000 lines buffered at once), rising slightly to 134 MB at 64 workers due to OS thread stack allocations.</w:t>
       </w:r>
       <w:r>
         <w:rPr>
@@ -5761,7 +5761,7 @@
           <w:szCs w:val="24"/>
           <w:rtl w:val="0"/>
         </w:rPr>
-        <w:t xml:space="preserve">Task 1a is much faster than Task 1c and scales with threads. In Task 1a, time drops from 1099 ms on 1 thread to 202 ms on 16 threads (5.44x speed-up) because the file is partitioned by byte offsets in advance, allowing all threads to read and parse concurrently. In Task 1c, time starts at ~1145 ms on 1 worker and gets slower as workers are added (~1412 ms at 8 workers, ~2534 ms at 64 workers). Task 1c stops getting faster right at 1 worker. The bottleneck is the single reader thread: one thread reading 50 000 000 lines from disk sequentially cannot produce lines faster than ~1.2s. Workers cannot parse faster than the reader feeds them. Adding more workers just adds queue lock contention and context switches without any extra throughput.</w:t>
+        <w:t xml:space="preserve">Task 1a is much faster than Task 1c and scales with threads. In Task 1a, time drops from 1099 ms on 1 thread to 202 ms on 16 threads (5.44x speed-up) because the file is partitioned by byte offsets in advance, allowing all threads to read and parse concurrently. In Task 1c, time starts at ~1145 ms on 1 worker and gets slower as workers are added (~1412 ms at 8 workers, ~2534 ms at 64 workers). Task 1c stops getting faster right at 1 worker. The bottleneck is the single reader thread: one thread reading 50 000 000 lines from disk sequentially cannot produce lines faster than ~1.1s. Workers cannot parse faster than the reader feeds them. Adding more workers just adds queue lock contention and context switches without any extra throughput.</w:t>
       </w:r>
       <w:r>
         <w:rPr>
@@ -5814,7 +5814,7 @@
           <w:szCs w:val="24"/>
           <w:rtl w:val="0"/>
         </w:rPr>
-        <w:t xml:space="preserve">With batches of a single line, the program would be extremely slow. Adding and removing 50 000 000 individual items from a thread-safe queue means 100 000 000 lock and signal operations. The queue overhead would dwarf the number parsing, making the run take minutes. Batches of 10 000 lines reduce queue operations to just 5 000. With a queue with no size limit, the reader would read ahead and load the entire file into memory before workers finish. Buffering 50 000 000 strings would take several gigabytes of RAM, causing garbage collector thrashing or an OutOfMemoryException. The 100-batch limit keeps memory low (~48-78 MB) by forcing the reader to wait when the queue is full.</w:t>
+        <w:t xml:space="preserve">With batches of a single line, the program would be extremely slow. Adding and removing 50 000 000 individual items from a thread-safe queue means 100 000 000 lock and signal operations. The queue overhead would dwarf the number parsing, making the run take minutes. Batches of 10 000 lines reduce queue operations to just 5 000. With a queue with no size limit, the reader would read ahead and load the entire file into memory before workers finish. Buffering 50 000 000 strings would take several gigabytes of RAM, causing garbage collector thrashing or an OutOfMemoryException. The 100-batch limit keeps memory low (~60-101 MB) by forcing the reader to wait when the queue is full.</w:t>
       </w:r>
       <w:r>
         <w:rPr>
@@ -6852,7 +6852,7 @@
           <w:szCs w:val="24"/>
           <w:rtl w:val="0"/>
         </w:rPr>
-        <w:t xml:space="preserve">Task 2 on a USB drive would be I/O-bound. The USB bus bandwidth limits throughput, and adding threads cannot overlap I/O on a single device. The time on one thread with USB would be much larger than on NVMe, and more threads would not reduce it proportionally.</w:t>
+        <w:t xml:space="preserve">Task 2 on a USB drive is I/O-bound. Evidence: 19 562 ms on USB vs 398 ms on NVMe for the same data on 1 thread (49x slower). Adding threads did not help: 1, 2 and 4 threads all took ~19–20 seconds, because the USB bus serializes all I/O on a single channel.</w:t>
       </w:r>
       <w:r>
         <w:rPr>
@@ -6890,7 +6890,7 @@
           <w:szCs w:val="24"/>
           <w:rtl w:val="0"/>
         </w:rPr>
-        <w:t xml:space="preserve">In Task 1b, Version 3 shows that independent thread-local counters give near-instant execution (31 ms), while Version 1 shows that unsynchronized shared counters lose most updates, and Version 2 shows that fine-grained locking is 193x slower. In Task 1c, a single reader is an inescapable bottleneck: adding consumers cannot speed up a pipeline when the producer is already at 100%.</w:t>
+        <w:t xml:space="preserve">In Task 1b, Version 3 shows that independent thread-local counters give near-instant execution (26 ms), while Version 1 shows that unsynchronized shared counters lose most updates, and Version 2 shows that fine-grained locking is 193x slower. In Task 1c, a single reader is an inescapable bottleneck: adding consumers cannot speed up a pipeline when the producer is already at 100%.</w:t>
       </w:r>
       <w:r>
         <w:rPr>

</xml_diff>